<commit_message>
Updated 3.5.1-to-3.5.0 translations for v3.5.1.251001CP2 (build number update only, no substantive changes).
</commit_message>
<xml_diff>
--- a/Translation/v3.5.1 to v3.5.0/documentation.docx
+++ b/Translation/v3.5.1 to v3.5.0/documentation.docx
@@ -74,6 +74,31 @@
     </w:p>
     <w:p>
       <w:r>
+        <w:t xml:space="preserve">September </w:t>
+      </w:r>
+      <w:r>
+        <w:t>25, 2025 (Updated to versions 3.5.1.25</w:t>
+      </w:r>
+      <w:r>
+        <w:t>1001</w:t>
+      </w:r>
+      <w:r>
+        <w:t>CP</w:t>
+      </w:r>
+      <w:r>
+        <w:t>2</w:t>
+      </w:r>
+      <w:r>
+        <w:t xml:space="preserve"> and 3.5.0.25</w:t>
+      </w:r>
+      <w:r>
+        <w:t>1001CP6</w:t>
+      </w:r>
+      <w:r>
+        <w:t>; no substantive changes)</w:t>
+      </w:r>
+      <w:r>
+        <w:br/>
         <w:t>February 25, 2025 (Updated to versions 3.5.1.250403CP1 and 3.5.0.250403CP5; no substantive changes)</w:t>
       </w:r>
       <w:r>
@@ -251,7 +276,6 @@
         <w:tc>
           <w:tcPr>
             <w:tcW w:w="2822" w:type="dxa"/>
-            <w:shd w:val="clear" w:color="auto" w:fill="auto"/>
             <w:noWrap/>
           </w:tcPr>
           <w:p>
@@ -274,7 +298,6 @@
         <w:tc>
           <w:tcPr>
             <w:tcW w:w="5088" w:type="dxa"/>
-            <w:shd w:val="clear" w:color="auto" w:fill="auto"/>
             <w:noWrap/>
           </w:tcPr>
           <w:p>
@@ -302,7 +325,6 @@
         <w:tc>
           <w:tcPr>
             <w:tcW w:w="2822" w:type="dxa"/>
-            <w:shd w:val="clear" w:color="auto" w:fill="auto"/>
             <w:noWrap/>
           </w:tcPr>
           <w:p>
@@ -325,7 +347,6 @@
         <w:tc>
           <w:tcPr>
             <w:tcW w:w="5088" w:type="dxa"/>
-            <w:shd w:val="clear" w:color="auto" w:fill="auto"/>
             <w:noWrap/>
           </w:tcPr>
           <w:p>
@@ -360,7 +381,6 @@
         <w:tc>
           <w:tcPr>
             <w:tcW w:w="2822" w:type="dxa"/>
-            <w:shd w:val="clear" w:color="auto" w:fill="auto"/>
             <w:noWrap/>
           </w:tcPr>
           <w:p>
@@ -383,7 +403,6 @@
         <w:tc>
           <w:tcPr>
             <w:tcW w:w="5088" w:type="dxa"/>
-            <w:shd w:val="clear" w:color="auto" w:fill="auto"/>
             <w:noWrap/>
           </w:tcPr>
           <w:p>
@@ -411,7 +430,6 @@
         <w:tc>
           <w:tcPr>
             <w:tcW w:w="2822" w:type="dxa"/>
-            <w:shd w:val="clear" w:color="auto" w:fill="auto"/>
             <w:noWrap/>
           </w:tcPr>
           <w:p>
@@ -434,7 +452,6 @@
         <w:tc>
           <w:tcPr>
             <w:tcW w:w="5088" w:type="dxa"/>
-            <w:shd w:val="clear" w:color="auto" w:fill="auto"/>
             <w:noWrap/>
           </w:tcPr>
           <w:p>
@@ -462,7 +479,6 @@
         <w:tc>
           <w:tcPr>
             <w:tcW w:w="2822" w:type="dxa"/>
-            <w:shd w:val="clear" w:color="auto" w:fill="auto"/>
             <w:noWrap/>
           </w:tcPr>
           <w:p>
@@ -485,7 +501,6 @@
         <w:tc>
           <w:tcPr>
             <w:tcW w:w="5088" w:type="dxa"/>
-            <w:shd w:val="clear" w:color="auto" w:fill="auto"/>
             <w:noWrap/>
           </w:tcPr>
           <w:p>
@@ -513,7 +528,6 @@
         <w:tc>
           <w:tcPr>
             <w:tcW w:w="2822" w:type="dxa"/>
-            <w:shd w:val="clear" w:color="auto" w:fill="auto"/>
             <w:noWrap/>
           </w:tcPr>
           <w:p>
@@ -536,7 +550,6 @@
         <w:tc>
           <w:tcPr>
             <w:tcW w:w="5088" w:type="dxa"/>
-            <w:shd w:val="clear" w:color="auto" w:fill="auto"/>
             <w:noWrap/>
           </w:tcPr>
           <w:p>
@@ -564,7 +577,6 @@
         <w:tc>
           <w:tcPr>
             <w:tcW w:w="2822" w:type="dxa"/>
-            <w:shd w:val="clear" w:color="auto" w:fill="auto"/>
             <w:noWrap/>
           </w:tcPr>
           <w:p>
@@ -587,7 +599,6 @@
         <w:tc>
           <w:tcPr>
             <w:tcW w:w="5088" w:type="dxa"/>
-            <w:shd w:val="clear" w:color="auto" w:fill="auto"/>
             <w:noWrap/>
           </w:tcPr>
           <w:p>
@@ -615,7 +626,6 @@
         <w:tc>
           <w:tcPr>
             <w:tcW w:w="2822" w:type="dxa"/>
-            <w:shd w:val="clear" w:color="auto" w:fill="auto"/>
             <w:noWrap/>
           </w:tcPr>
           <w:p>
@@ -638,7 +648,6 @@
         <w:tc>
           <w:tcPr>
             <w:tcW w:w="5088" w:type="dxa"/>
-            <w:shd w:val="clear" w:color="auto" w:fill="auto"/>
             <w:noWrap/>
           </w:tcPr>
           <w:p>
@@ -666,7 +675,6 @@
         <w:tc>
           <w:tcPr>
             <w:tcW w:w="2822" w:type="dxa"/>
-            <w:shd w:val="clear" w:color="auto" w:fill="auto"/>
             <w:noWrap/>
           </w:tcPr>
           <w:p>
@@ -689,7 +697,6 @@
         <w:tc>
           <w:tcPr>
             <w:tcW w:w="5088" w:type="dxa"/>
-            <w:shd w:val="clear" w:color="auto" w:fill="auto"/>
             <w:noWrap/>
           </w:tcPr>
           <w:p>
@@ -710,7 +717,6 @@
         <w:tc>
           <w:tcPr>
             <w:tcW w:w="2822" w:type="dxa"/>
-            <w:shd w:val="clear" w:color="auto" w:fill="auto"/>
             <w:noWrap/>
           </w:tcPr>
           <w:p>
@@ -733,7 +739,6 @@
         <w:tc>
           <w:tcPr>
             <w:tcW w:w="5088" w:type="dxa"/>
-            <w:shd w:val="clear" w:color="auto" w:fill="auto"/>
             <w:noWrap/>
           </w:tcPr>
           <w:p>
@@ -754,7 +759,6 @@
         <w:tc>
           <w:tcPr>
             <w:tcW w:w="2822" w:type="dxa"/>
-            <w:shd w:val="clear" w:color="auto" w:fill="auto"/>
             <w:noWrap/>
           </w:tcPr>
           <w:p>
@@ -777,7 +781,6 @@
         <w:tc>
           <w:tcPr>
             <w:tcW w:w="5088" w:type="dxa"/>
-            <w:shd w:val="clear" w:color="auto" w:fill="auto"/>
             <w:noWrap/>
           </w:tcPr>
           <w:p>
@@ -805,7 +808,6 @@
         <w:tc>
           <w:tcPr>
             <w:tcW w:w="2822" w:type="dxa"/>
-            <w:shd w:val="clear" w:color="auto" w:fill="auto"/>
             <w:noWrap/>
           </w:tcPr>
           <w:p>
@@ -828,7 +830,6 @@
         <w:tc>
           <w:tcPr>
             <w:tcW w:w="5088" w:type="dxa"/>
-            <w:shd w:val="clear" w:color="auto" w:fill="auto"/>
             <w:noWrap/>
           </w:tcPr>
           <w:p>
@@ -856,7 +857,6 @@
         <w:tc>
           <w:tcPr>
             <w:tcW w:w="2822" w:type="dxa"/>
-            <w:shd w:val="clear" w:color="auto" w:fill="auto"/>
             <w:noWrap/>
           </w:tcPr>
           <w:p>
@@ -879,7 +879,6 @@
         <w:tc>
           <w:tcPr>
             <w:tcW w:w="5088" w:type="dxa"/>
-            <w:shd w:val="clear" w:color="auto" w:fill="auto"/>
             <w:noWrap/>
           </w:tcPr>
           <w:p>
@@ -907,7 +906,6 @@
         <w:tc>
           <w:tcPr>
             <w:tcW w:w="2822" w:type="dxa"/>
-            <w:shd w:val="clear" w:color="auto" w:fill="auto"/>
             <w:noWrap/>
           </w:tcPr>
           <w:p>
@@ -930,7 +928,6 @@
         <w:tc>
           <w:tcPr>
             <w:tcW w:w="5088" w:type="dxa"/>
-            <w:shd w:val="clear" w:color="auto" w:fill="auto"/>
             <w:noWrap/>
           </w:tcPr>
           <w:p>
@@ -1155,7 +1152,6 @@
               <w:bottom w:val="single" w:sz="4" w:space="0" w:color="auto"/>
               <w:right w:val="single" w:sz="4" w:space="0" w:color="auto"/>
             </w:tcBorders>
-            <w:shd w:val="clear" w:color="auto" w:fill="auto"/>
             <w:noWrap/>
           </w:tcPr>
           <w:p>
@@ -1184,7 +1180,6 @@
               <w:bottom w:val="single" w:sz="4" w:space="0" w:color="auto"/>
               <w:right w:val="single" w:sz="4" w:space="0" w:color="auto"/>
             </w:tcBorders>
-            <w:shd w:val="clear" w:color="auto" w:fill="auto"/>
             <w:noWrap/>
           </w:tcPr>
           <w:p>
@@ -1220,7 +1215,6 @@
               <w:bottom w:val="single" w:sz="4" w:space="0" w:color="auto"/>
               <w:right w:val="single" w:sz="4" w:space="0" w:color="auto"/>
             </w:tcBorders>
-            <w:shd w:val="clear" w:color="auto" w:fill="auto"/>
             <w:noWrap/>
           </w:tcPr>
           <w:p>
@@ -1249,7 +1243,6 @@
               <w:bottom w:val="single" w:sz="4" w:space="0" w:color="auto"/>
               <w:right w:val="single" w:sz="4" w:space="0" w:color="auto"/>
             </w:tcBorders>
-            <w:shd w:val="clear" w:color="auto" w:fill="auto"/>
             <w:noWrap/>
           </w:tcPr>
           <w:p>
@@ -1278,7 +1271,6 @@
               <w:bottom w:val="single" w:sz="4" w:space="0" w:color="auto"/>
               <w:right w:val="single" w:sz="4" w:space="0" w:color="auto"/>
             </w:tcBorders>
-            <w:shd w:val="clear" w:color="auto" w:fill="auto"/>
             <w:noWrap/>
           </w:tcPr>
           <w:p>
@@ -1307,7 +1299,6 @@
               <w:bottom w:val="single" w:sz="4" w:space="0" w:color="auto"/>
               <w:right w:val="single" w:sz="4" w:space="0" w:color="auto"/>
             </w:tcBorders>
-            <w:shd w:val="clear" w:color="auto" w:fill="auto"/>
             <w:noWrap/>
           </w:tcPr>
           <w:p>
@@ -1341,7 +1332,6 @@
               <w:left w:val="single" w:sz="4" w:space="0" w:color="auto"/>
               <w:right w:val="single" w:sz="4" w:space="0" w:color="auto"/>
             </w:tcBorders>
-            <w:shd w:val="clear" w:color="auto" w:fill="auto"/>
             <w:noWrap/>
           </w:tcPr>
           <w:p>
@@ -1370,7 +1360,6 @@
               <w:left w:val="single" w:sz="4" w:space="0" w:color="auto"/>
               <w:right w:val="single" w:sz="4" w:space="0" w:color="auto"/>
             </w:tcBorders>
-            <w:shd w:val="clear" w:color="auto" w:fill="auto"/>
             <w:noWrap/>
           </w:tcPr>
           <w:p>
@@ -1399,7 +1388,6 @@
               <w:bottom w:val="single" w:sz="4" w:space="0" w:color="auto"/>
               <w:right w:val="single" w:sz="4" w:space="0" w:color="auto"/>
             </w:tcBorders>
-            <w:shd w:val="clear" w:color="auto" w:fill="auto"/>
             <w:noWrap/>
           </w:tcPr>
           <w:p>
@@ -1428,7 +1416,6 @@
               <w:bottom w:val="single" w:sz="4" w:space="0" w:color="auto"/>
               <w:right w:val="single" w:sz="4" w:space="0" w:color="auto"/>
             </w:tcBorders>
-            <w:shd w:val="clear" w:color="auto" w:fill="auto"/>
             <w:noWrap/>
           </w:tcPr>
           <w:p>
@@ -1457,7 +1444,6 @@
               <w:left w:val="single" w:sz="4" w:space="0" w:color="auto"/>
               <w:right w:val="single" w:sz="4" w:space="0" w:color="auto"/>
             </w:tcBorders>
-            <w:shd w:val="clear" w:color="auto" w:fill="auto"/>
             <w:noWrap/>
           </w:tcPr>
           <w:p>
@@ -1486,7 +1472,6 @@
               <w:left w:val="single" w:sz="4" w:space="0" w:color="auto"/>
               <w:right w:val="single" w:sz="4" w:space="0" w:color="auto"/>
             </w:tcBorders>
-            <w:shd w:val="clear" w:color="auto" w:fill="auto"/>
             <w:noWrap/>
           </w:tcPr>
           <w:p>
@@ -1519,7 +1504,6 @@
               <w:left w:val="single" w:sz="4" w:space="0" w:color="auto"/>
               <w:right w:val="single" w:sz="4" w:space="0" w:color="auto"/>
             </w:tcBorders>
-            <w:shd w:val="clear" w:color="auto" w:fill="auto"/>
             <w:noWrap/>
           </w:tcPr>
           <w:p>
@@ -1540,7 +1524,6 @@
               <w:left w:val="single" w:sz="4" w:space="0" w:color="auto"/>
               <w:right w:val="single" w:sz="4" w:space="0" w:color="auto"/>
             </w:tcBorders>
-            <w:shd w:val="clear" w:color="auto" w:fill="auto"/>
             <w:noWrap/>
           </w:tcPr>
           <w:p>
@@ -1562,7 +1545,6 @@
               <w:bottom w:val="single" w:sz="4" w:space="0" w:color="auto"/>
               <w:right w:val="single" w:sz="4" w:space="0" w:color="auto"/>
             </w:tcBorders>
-            <w:shd w:val="clear" w:color="auto" w:fill="auto"/>
             <w:noWrap/>
           </w:tcPr>
           <w:p>
@@ -1591,7 +1573,6 @@
               <w:bottom w:val="single" w:sz="4" w:space="0" w:color="auto"/>
               <w:right w:val="single" w:sz="4" w:space="0" w:color="auto"/>
             </w:tcBorders>
-            <w:shd w:val="clear" w:color="auto" w:fill="auto"/>
             <w:noWrap/>
           </w:tcPr>
           <w:p>
@@ -1619,7 +1600,6 @@
               <w:left w:val="single" w:sz="4" w:space="0" w:color="auto"/>
               <w:right w:val="single" w:sz="4" w:space="0" w:color="auto"/>
             </w:tcBorders>
-            <w:shd w:val="clear" w:color="auto" w:fill="auto"/>
             <w:noWrap/>
           </w:tcPr>
           <w:p>
@@ -1640,7 +1620,6 @@
               <w:left w:val="single" w:sz="4" w:space="0" w:color="auto"/>
               <w:right w:val="single" w:sz="4" w:space="0" w:color="auto"/>
             </w:tcBorders>
-            <w:shd w:val="clear" w:color="auto" w:fill="auto"/>
             <w:noWrap/>
           </w:tcPr>
           <w:p>
@@ -1666,7 +1645,6 @@
               <w:left w:val="single" w:sz="4" w:space="0" w:color="auto"/>
               <w:right w:val="single" w:sz="4" w:space="0" w:color="auto"/>
             </w:tcBorders>
-            <w:shd w:val="clear" w:color="auto" w:fill="auto"/>
             <w:noWrap/>
           </w:tcPr>
           <w:p>
@@ -1687,7 +1665,6 @@
               <w:left w:val="single" w:sz="4" w:space="0" w:color="auto"/>
               <w:right w:val="single" w:sz="4" w:space="0" w:color="auto"/>
             </w:tcBorders>
-            <w:shd w:val="clear" w:color="auto" w:fill="auto"/>
             <w:noWrap/>
           </w:tcPr>
           <w:p>
@@ -1709,7 +1686,6 @@
               <w:bottom w:val="single" w:sz="4" w:space="0" w:color="auto"/>
               <w:right w:val="single" w:sz="4" w:space="0" w:color="auto"/>
             </w:tcBorders>
-            <w:shd w:val="clear" w:color="auto" w:fill="auto"/>
             <w:noWrap/>
           </w:tcPr>
           <w:p>
@@ -1738,7 +1714,6 @@
               <w:bottom w:val="single" w:sz="4" w:space="0" w:color="auto"/>
               <w:right w:val="single" w:sz="4" w:space="0" w:color="auto"/>
             </w:tcBorders>
-            <w:shd w:val="clear" w:color="auto" w:fill="auto"/>
             <w:noWrap/>
           </w:tcPr>
           <w:p>
@@ -1766,7 +1741,6 @@
               <w:left w:val="single" w:sz="4" w:space="0" w:color="auto"/>
               <w:right w:val="single" w:sz="4" w:space="0" w:color="auto"/>
             </w:tcBorders>
-            <w:shd w:val="clear" w:color="auto" w:fill="auto"/>
             <w:noWrap/>
           </w:tcPr>
           <w:p>
@@ -1787,7 +1761,6 @@
               <w:left w:val="single" w:sz="4" w:space="0" w:color="auto"/>
               <w:right w:val="single" w:sz="4" w:space="0" w:color="auto"/>
             </w:tcBorders>
-            <w:shd w:val="clear" w:color="auto" w:fill="auto"/>
             <w:noWrap/>
           </w:tcPr>
           <w:p>
@@ -1813,7 +1786,6 @@
               <w:left w:val="single" w:sz="4" w:space="0" w:color="auto"/>
               <w:right w:val="single" w:sz="4" w:space="0" w:color="auto"/>
             </w:tcBorders>
-            <w:shd w:val="clear" w:color="auto" w:fill="auto"/>
             <w:noWrap/>
           </w:tcPr>
           <w:p>
@@ -1834,7 +1806,6 @@
               <w:left w:val="single" w:sz="4" w:space="0" w:color="auto"/>
               <w:right w:val="single" w:sz="4" w:space="0" w:color="auto"/>
             </w:tcBorders>
-            <w:shd w:val="clear" w:color="auto" w:fill="auto"/>
             <w:noWrap/>
           </w:tcPr>
           <w:p>
@@ -1856,7 +1827,6 @@
               <w:bottom w:val="single" w:sz="4" w:space="0" w:color="auto"/>
               <w:right w:val="single" w:sz="4" w:space="0" w:color="auto"/>
             </w:tcBorders>
-            <w:shd w:val="clear" w:color="auto" w:fill="auto"/>
             <w:noWrap/>
           </w:tcPr>
           <w:p>
@@ -1885,7 +1855,6 @@
               <w:bottom w:val="single" w:sz="4" w:space="0" w:color="auto"/>
               <w:right w:val="single" w:sz="4" w:space="0" w:color="auto"/>
             </w:tcBorders>
-            <w:shd w:val="clear" w:color="auto" w:fill="auto"/>
             <w:noWrap/>
           </w:tcPr>
           <w:p>
@@ -1914,7 +1883,6 @@
               <w:bottom w:val="single" w:sz="4" w:space="0" w:color="auto"/>
               <w:right w:val="single" w:sz="4" w:space="0" w:color="auto"/>
             </w:tcBorders>
-            <w:shd w:val="clear" w:color="auto" w:fill="auto"/>
             <w:noWrap/>
           </w:tcPr>
           <w:p>
@@ -1936,7 +1904,6 @@
               <w:bottom w:val="single" w:sz="4" w:space="0" w:color="auto"/>
               <w:right w:val="single" w:sz="4" w:space="0" w:color="auto"/>
             </w:tcBorders>
-            <w:shd w:val="clear" w:color="auto" w:fill="auto"/>
             <w:noWrap/>
           </w:tcPr>
           <w:p>
@@ -1962,7 +1929,6 @@
               <w:left w:val="single" w:sz="4" w:space="0" w:color="auto"/>
               <w:right w:val="single" w:sz="4" w:space="0" w:color="auto"/>
             </w:tcBorders>
-            <w:shd w:val="clear" w:color="auto" w:fill="auto"/>
             <w:noWrap/>
           </w:tcPr>
           <w:p>
@@ -1990,7 +1956,6 @@
               <w:left w:val="single" w:sz="4" w:space="0" w:color="auto"/>
               <w:right w:val="single" w:sz="4" w:space="0" w:color="auto"/>
             </w:tcBorders>
-            <w:shd w:val="clear" w:color="auto" w:fill="auto"/>
             <w:noWrap/>
           </w:tcPr>
           <w:p>
@@ -2019,7 +1984,6 @@
               <w:bottom w:val="single" w:sz="4" w:space="0" w:color="auto"/>
               <w:right w:val="single" w:sz="4" w:space="0" w:color="auto"/>
             </w:tcBorders>
-            <w:shd w:val="clear" w:color="auto" w:fill="auto"/>
             <w:noWrap/>
           </w:tcPr>
           <w:p>
@@ -2052,7 +2016,6 @@
               <w:bottom w:val="single" w:sz="4" w:space="0" w:color="auto"/>
               <w:right w:val="single" w:sz="4" w:space="0" w:color="auto"/>
             </w:tcBorders>
-            <w:shd w:val="clear" w:color="auto" w:fill="auto"/>
             <w:noWrap/>
           </w:tcPr>
           <w:p>
@@ -2083,7 +2046,6 @@
               <w:left w:val="single" w:sz="4" w:space="0" w:color="auto"/>
               <w:right w:val="single" w:sz="4" w:space="0" w:color="auto"/>
             </w:tcBorders>
-            <w:shd w:val="clear" w:color="auto" w:fill="auto"/>
             <w:noWrap/>
           </w:tcPr>
           <w:p>
@@ -2124,7 +2086,6 @@
               <w:left w:val="single" w:sz="4" w:space="0" w:color="auto"/>
               <w:right w:val="single" w:sz="4" w:space="0" w:color="auto"/>
             </w:tcBorders>
-            <w:shd w:val="clear" w:color="auto" w:fill="auto"/>
             <w:noWrap/>
           </w:tcPr>
           <w:p>
@@ -2161,7 +2122,6 @@
               <w:left w:val="single" w:sz="4" w:space="0" w:color="auto"/>
               <w:right w:val="single" w:sz="4" w:space="0" w:color="auto"/>
             </w:tcBorders>
-            <w:shd w:val="clear" w:color="auto" w:fill="auto"/>
             <w:noWrap/>
           </w:tcPr>
           <w:p>
@@ -2182,7 +2142,6 @@
               <w:left w:val="single" w:sz="4" w:space="0" w:color="auto"/>
               <w:right w:val="single" w:sz="4" w:space="0" w:color="auto"/>
             </w:tcBorders>
-            <w:shd w:val="clear" w:color="auto" w:fill="auto"/>
             <w:noWrap/>
           </w:tcPr>
           <w:p>
@@ -2204,7 +2163,6 @@
               <w:bottom w:val="single" w:sz="4" w:space="0" w:color="auto"/>
               <w:right w:val="single" w:sz="4" w:space="0" w:color="auto"/>
             </w:tcBorders>
-            <w:shd w:val="clear" w:color="auto" w:fill="auto"/>
             <w:noWrap/>
           </w:tcPr>
           <w:p>
@@ -2233,7 +2191,6 @@
               <w:bottom w:val="single" w:sz="4" w:space="0" w:color="auto"/>
               <w:right w:val="single" w:sz="4" w:space="0" w:color="auto"/>
             </w:tcBorders>
-            <w:shd w:val="clear" w:color="auto" w:fill="auto"/>
             <w:noWrap/>
           </w:tcPr>
           <w:p>
@@ -2260,7 +2217,6 @@
               <w:left w:val="single" w:sz="4" w:space="0" w:color="auto"/>
               <w:right w:val="single" w:sz="4" w:space="0" w:color="auto"/>
             </w:tcBorders>
-            <w:shd w:val="clear" w:color="auto" w:fill="auto"/>
             <w:noWrap/>
           </w:tcPr>
           <w:p>
@@ -2287,7 +2243,6 @@
               <w:left w:val="single" w:sz="4" w:space="0" w:color="auto"/>
               <w:right w:val="single" w:sz="4" w:space="0" w:color="auto"/>
             </w:tcBorders>
-            <w:shd w:val="clear" w:color="auto" w:fill="auto"/>
             <w:noWrap/>
           </w:tcPr>
           <w:p>
@@ -2319,22 +2274,22 @@
               <w:left w:val="single" w:sz="4" w:space="0" w:color="auto"/>
               <w:right w:val="single" w:sz="4" w:space="0" w:color="auto"/>
             </w:tcBorders>
-            <w:shd w:val="clear" w:color="auto" w:fill="auto"/>
-            <w:noWrap/>
-          </w:tcPr>
-          <w:p>
-            <w:pPr>
-              <w:pStyle w:val="NoSpacing"/>
-              <w:rPr>
-                <w:sz w:val="18"/>
-                <w:szCs w:val="18"/>
-              </w:rPr>
-            </w:pPr>
-            <w:r>
-              <w:rPr>
-                <w:sz w:val="18"/>
-                <w:szCs w:val="18"/>
-              </w:rPr>
+            <w:noWrap/>
+          </w:tcPr>
+          <w:p>
+            <w:pPr>
+              <w:pStyle w:val="NoSpacing"/>
+              <w:rPr>
+                <w:sz w:val="18"/>
+                <w:szCs w:val="18"/>
+              </w:rPr>
+            </w:pPr>
+            <w:r>
+              <w:rPr>
+                <w:sz w:val="18"/>
+                <w:szCs w:val="18"/>
+              </w:rPr>
+              <w:lastRenderedPageBreak/>
               <w:t>eArrest.14</w:t>
             </w:r>
           </w:p>
@@ -2346,7 +2301,6 @@
               <w:left w:val="single" w:sz="4" w:space="0" w:color="auto"/>
               <w:right w:val="single" w:sz="4" w:space="0" w:color="auto"/>
             </w:tcBorders>
-            <w:shd w:val="clear" w:color="auto" w:fill="auto"/>
             <w:noWrap/>
           </w:tcPr>
           <w:p>
@@ -2375,7 +2329,6 @@
               <w:bottom w:val="single" w:sz="4" w:space="0" w:color="auto"/>
               <w:right w:val="single" w:sz="4" w:space="0" w:color="auto"/>
             </w:tcBorders>
-            <w:shd w:val="clear" w:color="auto" w:fill="auto"/>
             <w:noWrap/>
           </w:tcPr>
           <w:p>
@@ -2418,7 +2371,6 @@
               <w:bottom w:val="single" w:sz="4" w:space="0" w:color="auto"/>
               <w:right w:val="single" w:sz="4" w:space="0" w:color="auto"/>
             </w:tcBorders>
-            <w:shd w:val="clear" w:color="auto" w:fill="auto"/>
             <w:noWrap/>
           </w:tcPr>
           <w:p>
@@ -2445,7 +2397,6 @@
               <w:left w:val="single" w:sz="4" w:space="0" w:color="auto"/>
               <w:right w:val="single" w:sz="4" w:space="0" w:color="auto"/>
             </w:tcBorders>
-            <w:shd w:val="clear" w:color="auto" w:fill="auto"/>
             <w:noWrap/>
           </w:tcPr>
           <w:p>
@@ -2486,7 +2437,6 @@
               <w:left w:val="single" w:sz="4" w:space="0" w:color="auto"/>
               <w:right w:val="single" w:sz="4" w:space="0" w:color="auto"/>
             </w:tcBorders>
-            <w:shd w:val="clear" w:color="auto" w:fill="auto"/>
             <w:noWrap/>
           </w:tcPr>
           <w:p>
@@ -2523,7 +2473,6 @@
               <w:left w:val="single" w:sz="4" w:space="0" w:color="auto"/>
               <w:right w:val="single" w:sz="4" w:space="0" w:color="auto"/>
             </w:tcBorders>
-            <w:shd w:val="clear" w:color="auto" w:fill="auto"/>
             <w:noWrap/>
           </w:tcPr>
           <w:p>
@@ -2540,7 +2489,6 @@
                 <w:sz w:val="18"/>
                 <w:szCs w:val="18"/>
               </w:rPr>
-              <w:lastRenderedPageBreak/>
               <w:t>eHistory.17</w:t>
             </w:r>
           </w:p>
@@ -2553,7 +2501,6 @@
               <w:left w:val="single" w:sz="4" w:space="0" w:color="auto"/>
               <w:right w:val="single" w:sz="4" w:space="0" w:color="auto"/>
             </w:tcBorders>
-            <w:shd w:val="clear" w:color="auto" w:fill="auto"/>
             <w:noWrap/>
           </w:tcPr>
           <w:p>
@@ -2583,7 +2530,6 @@
               <w:bottom w:val="single" w:sz="4" w:space="0" w:color="auto"/>
               <w:right w:val="single" w:sz="4" w:space="0" w:color="auto"/>
             </w:tcBorders>
-            <w:shd w:val="clear" w:color="auto" w:fill="auto"/>
             <w:noWrap/>
           </w:tcPr>
           <w:p>
@@ -2613,7 +2559,6 @@
               <w:bottom w:val="single" w:sz="4" w:space="0" w:color="auto"/>
               <w:right w:val="single" w:sz="4" w:space="0" w:color="auto"/>
             </w:tcBorders>
-            <w:shd w:val="clear" w:color="auto" w:fill="auto"/>
             <w:noWrap/>
           </w:tcPr>
           <w:p>
@@ -2642,7 +2587,6 @@
               <w:left w:val="single" w:sz="4" w:space="0" w:color="auto"/>
               <w:right w:val="single" w:sz="4" w:space="0" w:color="auto"/>
             </w:tcBorders>
-            <w:shd w:val="clear" w:color="auto" w:fill="auto"/>
             <w:noWrap/>
           </w:tcPr>
           <w:p>
@@ -2685,7 +2629,6 @@
               <w:left w:val="single" w:sz="4" w:space="0" w:color="auto"/>
               <w:right w:val="single" w:sz="4" w:space="0" w:color="auto"/>
             </w:tcBorders>
-            <w:shd w:val="clear" w:color="auto" w:fill="auto"/>
             <w:noWrap/>
           </w:tcPr>
           <w:p>
@@ -2723,7 +2666,6 @@
               <w:left w:val="single" w:sz="4" w:space="0" w:color="auto"/>
               <w:right w:val="single" w:sz="4" w:space="0" w:color="auto"/>
             </w:tcBorders>
-            <w:shd w:val="clear" w:color="auto" w:fill="auto"/>
             <w:noWrap/>
           </w:tcPr>
           <w:p>
@@ -2744,7 +2686,6 @@
               <w:left w:val="single" w:sz="4" w:space="0" w:color="auto"/>
               <w:right w:val="single" w:sz="4" w:space="0" w:color="auto"/>
             </w:tcBorders>
-            <w:shd w:val="clear" w:color="auto" w:fill="auto"/>
             <w:noWrap/>
           </w:tcPr>
           <w:p>
@@ -2766,7 +2707,6 @@
               <w:bottom w:val="single" w:sz="4" w:space="0" w:color="auto"/>
               <w:right w:val="single" w:sz="4" w:space="0" w:color="auto"/>
             </w:tcBorders>
-            <w:shd w:val="clear" w:color="auto" w:fill="auto"/>
             <w:noWrap/>
           </w:tcPr>
           <w:p>
@@ -2802,7 +2742,6 @@
               <w:bottom w:val="single" w:sz="4" w:space="0" w:color="auto"/>
               <w:right w:val="single" w:sz="4" w:space="0" w:color="auto"/>
             </w:tcBorders>
-            <w:shd w:val="clear" w:color="auto" w:fill="auto"/>
             <w:noWrap/>
           </w:tcPr>
           <w:p>
@@ -2831,7 +2770,6 @@
               <w:bottom w:val="single" w:sz="4" w:space="0" w:color="auto"/>
               <w:right w:val="single" w:sz="4" w:space="0" w:color="auto"/>
             </w:tcBorders>
-            <w:shd w:val="clear" w:color="auto" w:fill="auto"/>
             <w:noWrap/>
           </w:tcPr>
           <w:p>
@@ -2853,7 +2791,6 @@
               <w:bottom w:val="single" w:sz="4" w:space="0" w:color="auto"/>
               <w:right w:val="single" w:sz="4" w:space="0" w:color="auto"/>
             </w:tcBorders>
-            <w:shd w:val="clear" w:color="auto" w:fill="auto"/>
             <w:noWrap/>
           </w:tcPr>
           <w:p>
@@ -2879,7 +2816,6 @@
               <w:left w:val="single" w:sz="4" w:space="0" w:color="auto"/>
               <w:right w:val="single" w:sz="4" w:space="0" w:color="auto"/>
             </w:tcBorders>
-            <w:shd w:val="clear" w:color="auto" w:fill="auto"/>
             <w:noWrap/>
           </w:tcPr>
           <w:p>
@@ -2907,7 +2843,6 @@
               <w:left w:val="single" w:sz="4" w:space="0" w:color="auto"/>
               <w:right w:val="single" w:sz="4" w:space="0" w:color="auto"/>
             </w:tcBorders>
-            <w:shd w:val="clear" w:color="auto" w:fill="auto"/>
             <w:noWrap/>
           </w:tcPr>
           <w:p>
@@ -2936,7 +2871,6 @@
               <w:bottom w:val="single" w:sz="4" w:space="0" w:color="auto"/>
               <w:right w:val="single" w:sz="4" w:space="0" w:color="auto"/>
             </w:tcBorders>
-            <w:shd w:val="clear" w:color="auto" w:fill="auto"/>
             <w:noWrap/>
           </w:tcPr>
           <w:p>
@@ -2965,7 +2899,6 @@
               <w:bottom w:val="single" w:sz="4" w:space="0" w:color="auto"/>
               <w:right w:val="single" w:sz="4" w:space="0" w:color="auto"/>
             </w:tcBorders>
-            <w:shd w:val="clear" w:color="auto" w:fill="auto"/>
             <w:noWrap/>
           </w:tcPr>
           <w:p>
@@ -2992,7 +2925,6 @@
               <w:left w:val="single" w:sz="4" w:space="0" w:color="auto"/>
               <w:right w:val="single" w:sz="4" w:space="0" w:color="auto"/>
             </w:tcBorders>
-            <w:shd w:val="clear" w:color="auto" w:fill="auto"/>
             <w:noWrap/>
           </w:tcPr>
           <w:p>
@@ -3019,7 +2951,6 @@
               <w:left w:val="single" w:sz="4" w:space="0" w:color="auto"/>
               <w:right w:val="single" w:sz="4" w:space="0" w:color="auto"/>
             </w:tcBorders>
-            <w:shd w:val="clear" w:color="auto" w:fill="auto"/>
             <w:noWrap/>
           </w:tcPr>
           <w:p>
@@ -3052,7 +2983,6 @@
               <w:left w:val="single" w:sz="4" w:space="0" w:color="auto"/>
               <w:right w:val="single" w:sz="4" w:space="0" w:color="auto"/>
             </w:tcBorders>
-            <w:shd w:val="clear" w:color="auto" w:fill="auto"/>
             <w:noWrap/>
           </w:tcPr>
           <w:p>
@@ -3073,7 +3003,6 @@
               <w:left w:val="single" w:sz="4" w:space="0" w:color="auto"/>
               <w:right w:val="single" w:sz="4" w:space="0" w:color="auto"/>
             </w:tcBorders>
-            <w:shd w:val="clear" w:color="auto" w:fill="auto"/>
             <w:noWrap/>
           </w:tcPr>
           <w:p>
@@ -3095,7 +3024,6 @@
               <w:bottom w:val="single" w:sz="4" w:space="0" w:color="auto"/>
               <w:right w:val="single" w:sz="4" w:space="0" w:color="auto"/>
             </w:tcBorders>
-            <w:shd w:val="clear" w:color="auto" w:fill="auto"/>
             <w:noWrap/>
           </w:tcPr>
           <w:p>
@@ -3124,7 +3052,6 @@
               <w:bottom w:val="single" w:sz="4" w:space="0" w:color="auto"/>
               <w:right w:val="single" w:sz="4" w:space="0" w:color="auto"/>
             </w:tcBorders>
-            <w:shd w:val="clear" w:color="auto" w:fill="auto"/>
             <w:noWrap/>
           </w:tcPr>
           <w:p>
@@ -3151,7 +3078,6 @@
               <w:left w:val="single" w:sz="4" w:space="0" w:color="auto"/>
               <w:right w:val="single" w:sz="4" w:space="0" w:color="auto"/>
             </w:tcBorders>
-            <w:shd w:val="clear" w:color="auto" w:fill="auto"/>
             <w:noWrap/>
           </w:tcPr>
           <w:p>
@@ -3178,7 +3104,6 @@
               <w:left w:val="single" w:sz="4" w:space="0" w:color="auto"/>
               <w:right w:val="single" w:sz="4" w:space="0" w:color="auto"/>
             </w:tcBorders>
-            <w:shd w:val="clear" w:color="auto" w:fill="auto"/>
             <w:noWrap/>
           </w:tcPr>
           <w:p>
@@ -3211,7 +3136,6 @@
               <w:left w:val="single" w:sz="4" w:space="0" w:color="auto"/>
               <w:right w:val="single" w:sz="4" w:space="0" w:color="auto"/>
             </w:tcBorders>
-            <w:shd w:val="clear" w:color="auto" w:fill="auto"/>
             <w:noWrap/>
           </w:tcPr>
           <w:p>
@@ -3232,7 +3156,6 @@
               <w:left w:val="single" w:sz="4" w:space="0" w:color="auto"/>
               <w:right w:val="single" w:sz="4" w:space="0" w:color="auto"/>
             </w:tcBorders>
-            <w:shd w:val="clear" w:color="auto" w:fill="auto"/>
             <w:noWrap/>
           </w:tcPr>
           <w:p>
@@ -3254,7 +3177,6 @@
               <w:bottom w:val="single" w:sz="4" w:space="0" w:color="auto"/>
               <w:right w:val="single" w:sz="4" w:space="0" w:color="auto"/>
             </w:tcBorders>
-            <w:shd w:val="clear" w:color="auto" w:fill="auto"/>
             <w:noWrap/>
           </w:tcPr>
           <w:p>
@@ -3283,7 +3205,6 @@
               <w:bottom w:val="single" w:sz="4" w:space="0" w:color="auto"/>
               <w:right w:val="single" w:sz="4" w:space="0" w:color="auto"/>
             </w:tcBorders>
-            <w:shd w:val="clear" w:color="auto" w:fill="auto"/>
             <w:noWrap/>
           </w:tcPr>
           <w:p>
@@ -3310,7 +3231,6 @@
               <w:left w:val="single" w:sz="4" w:space="0" w:color="auto"/>
               <w:right w:val="single" w:sz="4" w:space="0" w:color="auto"/>
             </w:tcBorders>
-            <w:shd w:val="clear" w:color="auto" w:fill="auto"/>
             <w:noWrap/>
           </w:tcPr>
           <w:p>
@@ -3337,7 +3257,6 @@
               <w:left w:val="single" w:sz="4" w:space="0" w:color="auto"/>
               <w:right w:val="single" w:sz="4" w:space="0" w:color="auto"/>
             </w:tcBorders>
-            <w:shd w:val="clear" w:color="auto" w:fill="auto"/>
             <w:noWrap/>
           </w:tcPr>
           <w:p>
@@ -3370,7 +3289,6 @@
               <w:left w:val="single" w:sz="4" w:space="0" w:color="auto"/>
               <w:right w:val="single" w:sz="4" w:space="0" w:color="auto"/>
             </w:tcBorders>
-            <w:shd w:val="clear" w:color="auto" w:fill="auto"/>
             <w:noWrap/>
           </w:tcPr>
           <w:p>
@@ -3398,7 +3316,6 @@
               <w:left w:val="single" w:sz="4" w:space="0" w:color="auto"/>
               <w:right w:val="single" w:sz="4" w:space="0" w:color="auto"/>
             </w:tcBorders>
-            <w:shd w:val="clear" w:color="auto" w:fill="auto"/>
             <w:noWrap/>
           </w:tcPr>
           <w:p>
@@ -3427,7 +3344,6 @@
               <w:bottom w:val="single" w:sz="4" w:space="0" w:color="auto"/>
               <w:right w:val="single" w:sz="4" w:space="0" w:color="auto"/>
             </w:tcBorders>
-            <w:shd w:val="clear" w:color="auto" w:fill="auto"/>
             <w:noWrap/>
           </w:tcPr>
           <w:p>
@@ -3456,7 +3372,6 @@
               <w:bottom w:val="single" w:sz="4" w:space="0" w:color="auto"/>
               <w:right w:val="single" w:sz="4" w:space="0" w:color="auto"/>
             </w:tcBorders>
-            <w:shd w:val="clear" w:color="auto" w:fill="auto"/>
             <w:noWrap/>
           </w:tcPr>
           <w:p>
@@ -3483,7 +3398,6 @@
               <w:left w:val="single" w:sz="4" w:space="0" w:color="auto"/>
               <w:right w:val="single" w:sz="4" w:space="0" w:color="auto"/>
             </w:tcBorders>
-            <w:shd w:val="clear" w:color="auto" w:fill="auto"/>
             <w:noWrap/>
           </w:tcPr>
           <w:p>
@@ -3510,7 +3424,6 @@
               <w:left w:val="single" w:sz="4" w:space="0" w:color="auto"/>
               <w:right w:val="single" w:sz="4" w:space="0" w:color="auto"/>
             </w:tcBorders>
-            <w:shd w:val="clear" w:color="auto" w:fill="auto"/>
             <w:noWrap/>
           </w:tcPr>
           <w:p>
@@ -3543,7 +3456,6 @@
               <w:left w:val="single" w:sz="4" w:space="0" w:color="auto"/>
               <w:right w:val="single" w:sz="4" w:space="0" w:color="auto"/>
             </w:tcBorders>
-            <w:shd w:val="clear" w:color="auto" w:fill="auto"/>
             <w:noWrap/>
           </w:tcPr>
           <w:p>
@@ -3564,7 +3476,6 @@
               <w:left w:val="single" w:sz="4" w:space="0" w:color="auto"/>
               <w:right w:val="single" w:sz="4" w:space="0" w:color="auto"/>
             </w:tcBorders>
-            <w:shd w:val="clear" w:color="auto" w:fill="auto"/>
             <w:noWrap/>
           </w:tcPr>
           <w:p>
@@ -3586,7 +3497,6 @@
               <w:bottom w:val="single" w:sz="4" w:space="0" w:color="auto"/>
               <w:right w:val="single" w:sz="4" w:space="0" w:color="auto"/>
             </w:tcBorders>
-            <w:shd w:val="clear" w:color="auto" w:fill="auto"/>
             <w:noWrap/>
           </w:tcPr>
           <w:p>
@@ -3622,7 +3532,6 @@
               <w:bottom w:val="single" w:sz="4" w:space="0" w:color="auto"/>
               <w:right w:val="single" w:sz="4" w:space="0" w:color="auto"/>
             </w:tcBorders>
-            <w:shd w:val="clear" w:color="auto" w:fill="auto"/>
             <w:noWrap/>
           </w:tcPr>
           <w:p>
@@ -3656,7 +3565,6 @@
               <w:left w:val="single" w:sz="4" w:space="0" w:color="auto"/>
               <w:right w:val="single" w:sz="4" w:space="0" w:color="auto"/>
             </w:tcBorders>
-            <w:shd w:val="clear" w:color="auto" w:fill="auto"/>
             <w:noWrap/>
           </w:tcPr>
           <w:p>
@@ -3690,7 +3598,6 @@
               <w:left w:val="single" w:sz="4" w:space="0" w:color="auto"/>
               <w:right w:val="single" w:sz="4" w:space="0" w:color="auto"/>
             </w:tcBorders>
-            <w:shd w:val="clear" w:color="auto" w:fill="auto"/>
             <w:noWrap/>
           </w:tcPr>
           <w:p>
@@ -3729,7 +3636,6 @@
               <w:left w:val="single" w:sz="4" w:space="0" w:color="auto"/>
               <w:right w:val="single" w:sz="4" w:space="0" w:color="auto"/>
             </w:tcBorders>
-            <w:shd w:val="clear" w:color="auto" w:fill="auto"/>
             <w:noWrap/>
           </w:tcPr>
           <w:p>
@@ -3756,7 +3662,6 @@
               <w:left w:val="single" w:sz="4" w:space="0" w:color="auto"/>
               <w:right w:val="single" w:sz="4" w:space="0" w:color="auto"/>
             </w:tcBorders>
-            <w:shd w:val="clear" w:color="auto" w:fill="auto"/>
             <w:noWrap/>
           </w:tcPr>
           <w:p>
@@ -3785,7 +3690,6 @@
               <w:bottom w:val="single" w:sz="4" w:space="0" w:color="auto"/>
               <w:right w:val="single" w:sz="4" w:space="0" w:color="auto"/>
             </w:tcBorders>
-            <w:shd w:val="clear" w:color="auto" w:fill="auto"/>
             <w:noWrap/>
           </w:tcPr>
           <w:p>
@@ -3828,7 +3732,6 @@
               <w:bottom w:val="single" w:sz="4" w:space="0" w:color="auto"/>
               <w:right w:val="single" w:sz="4" w:space="0" w:color="auto"/>
             </w:tcBorders>
-            <w:shd w:val="clear" w:color="auto" w:fill="auto"/>
             <w:noWrap/>
           </w:tcPr>
           <w:p>
@@ -3859,7 +3762,6 @@
               <w:left w:val="single" w:sz="4" w:space="0" w:color="auto"/>
               <w:right w:val="single" w:sz="4" w:space="0" w:color="auto"/>
             </w:tcBorders>
-            <w:shd w:val="clear" w:color="auto" w:fill="auto"/>
             <w:noWrap/>
           </w:tcPr>
           <w:p>
@@ -3898,7 +3800,6 @@
               <w:left w:val="single" w:sz="4" w:space="0" w:color="auto"/>
               <w:right w:val="single" w:sz="4" w:space="0" w:color="auto"/>
             </w:tcBorders>
-            <w:shd w:val="clear" w:color="auto" w:fill="auto"/>
             <w:noWrap/>
           </w:tcPr>
           <w:p>
@@ -3933,7 +3834,6 @@
               <w:left w:val="single" w:sz="4" w:space="0" w:color="auto"/>
               <w:right w:val="single" w:sz="4" w:space="0" w:color="auto"/>
             </w:tcBorders>
-            <w:shd w:val="clear" w:color="auto" w:fill="auto"/>
             <w:noWrap/>
           </w:tcPr>
           <w:p>
@@ -3961,7 +3861,6 @@
               <w:left w:val="single" w:sz="4" w:space="0" w:color="auto"/>
               <w:right w:val="single" w:sz="4" w:space="0" w:color="auto"/>
             </w:tcBorders>
-            <w:shd w:val="clear" w:color="auto" w:fill="auto"/>
             <w:noWrap/>
           </w:tcPr>
           <w:p>
@@ -3990,7 +3889,6 @@
               <w:bottom w:val="single" w:sz="4" w:space="0" w:color="auto"/>
               <w:right w:val="single" w:sz="4" w:space="0" w:color="auto"/>
             </w:tcBorders>
-            <w:shd w:val="clear" w:color="auto" w:fill="auto"/>
             <w:noWrap/>
           </w:tcPr>
           <w:p>
@@ -4021,7 +3919,6 @@
               <w:bottom w:val="single" w:sz="4" w:space="0" w:color="auto"/>
               <w:right w:val="single" w:sz="4" w:space="0" w:color="auto"/>
             </w:tcBorders>
-            <w:shd w:val="clear" w:color="auto" w:fill="auto"/>
             <w:noWrap/>
           </w:tcPr>
           <w:p>
@@ -4051,7 +3948,6 @@
               <w:left w:val="single" w:sz="4" w:space="0" w:color="auto"/>
               <w:right w:val="single" w:sz="4" w:space="0" w:color="auto"/>
             </w:tcBorders>
-            <w:shd w:val="clear" w:color="auto" w:fill="auto"/>
             <w:noWrap/>
           </w:tcPr>
           <w:p>
@@ -4079,7 +3975,6 @@
               <w:left w:val="single" w:sz="4" w:space="0" w:color="auto"/>
               <w:right w:val="single" w:sz="4" w:space="0" w:color="auto"/>
             </w:tcBorders>
-            <w:shd w:val="clear" w:color="auto" w:fill="auto"/>
             <w:noWrap/>
           </w:tcPr>
           <w:p>
@@ -4112,7 +4007,6 @@
               <w:left w:val="single" w:sz="4" w:space="0" w:color="auto"/>
               <w:right w:val="single" w:sz="4" w:space="0" w:color="auto"/>
             </w:tcBorders>
-            <w:shd w:val="clear" w:color="auto" w:fill="auto"/>
             <w:noWrap/>
           </w:tcPr>
           <w:p>
@@ -4133,7 +4027,6 @@
               <w:left w:val="single" w:sz="4" w:space="0" w:color="auto"/>
               <w:right w:val="single" w:sz="4" w:space="0" w:color="auto"/>
             </w:tcBorders>
-            <w:shd w:val="clear" w:color="auto" w:fill="auto"/>
             <w:noWrap/>
           </w:tcPr>
           <w:p>
@@ -4155,7 +4048,6 @@
               <w:bottom w:val="single" w:sz="4" w:space="0" w:color="auto"/>
               <w:right w:val="single" w:sz="4" w:space="0" w:color="auto"/>
             </w:tcBorders>
-            <w:shd w:val="clear" w:color="auto" w:fill="auto"/>
             <w:noWrap/>
           </w:tcPr>
           <w:p>
@@ -4186,7 +4078,6 @@
               <w:bottom w:val="single" w:sz="4" w:space="0" w:color="auto"/>
               <w:right w:val="single" w:sz="4" w:space="0" w:color="auto"/>
             </w:tcBorders>
-            <w:shd w:val="clear" w:color="auto" w:fill="auto"/>
             <w:noWrap/>
           </w:tcPr>
           <w:p>
@@ -4216,7 +4107,6 @@
               <w:left w:val="single" w:sz="4" w:space="0" w:color="auto"/>
               <w:right w:val="single" w:sz="4" w:space="0" w:color="auto"/>
             </w:tcBorders>
-            <w:shd w:val="clear" w:color="auto" w:fill="auto"/>
             <w:noWrap/>
           </w:tcPr>
           <w:p>
@@ -4239,7 +4129,6 @@
               <w:left w:val="single" w:sz="4" w:space="0" w:color="auto"/>
               <w:right w:val="single" w:sz="4" w:space="0" w:color="auto"/>
             </w:tcBorders>
-            <w:shd w:val="clear" w:color="auto" w:fill="auto"/>
             <w:noWrap/>
           </w:tcPr>
           <w:p>
@@ -4267,7 +4156,6 @@
               <w:left w:val="single" w:sz="4" w:space="0" w:color="auto"/>
               <w:right w:val="single" w:sz="4" w:space="0" w:color="auto"/>
             </w:tcBorders>
-            <w:shd w:val="clear" w:color="auto" w:fill="auto"/>
             <w:noWrap/>
           </w:tcPr>
           <w:p>
@@ -4288,7 +4176,6 @@
               <w:left w:val="single" w:sz="4" w:space="0" w:color="auto"/>
               <w:right w:val="single" w:sz="4" w:space="0" w:color="auto"/>
             </w:tcBorders>
-            <w:shd w:val="clear" w:color="auto" w:fill="auto"/>
             <w:noWrap/>
           </w:tcPr>
           <w:p>
@@ -4310,7 +4197,6 @@
               <w:bottom w:val="single" w:sz="4" w:space="0" w:color="auto"/>
               <w:right w:val="single" w:sz="4" w:space="0" w:color="auto"/>
             </w:tcBorders>
-            <w:shd w:val="clear" w:color="auto" w:fill="auto"/>
             <w:noWrap/>
           </w:tcPr>
           <w:p>
@@ -4339,7 +4225,6 @@
               <w:bottom w:val="single" w:sz="4" w:space="0" w:color="auto"/>
               <w:right w:val="single" w:sz="4" w:space="0" w:color="auto"/>
             </w:tcBorders>
-            <w:shd w:val="clear" w:color="auto" w:fill="auto"/>
             <w:noWrap/>
           </w:tcPr>
           <w:p>
@@ -4367,7 +4252,6 @@
               <w:left w:val="single" w:sz="4" w:space="0" w:color="auto"/>
               <w:right w:val="single" w:sz="4" w:space="0" w:color="auto"/>
             </w:tcBorders>
-            <w:shd w:val="clear" w:color="auto" w:fill="auto"/>
             <w:noWrap/>
           </w:tcPr>
           <w:p>
@@ -4404,7 +4288,6 @@
               <w:left w:val="single" w:sz="4" w:space="0" w:color="auto"/>
               <w:right w:val="single" w:sz="4" w:space="0" w:color="auto"/>
             </w:tcBorders>
-            <w:shd w:val="clear" w:color="auto" w:fill="auto"/>
             <w:noWrap/>
           </w:tcPr>
           <w:p>
@@ -4439,7 +4322,6 @@
               <w:left w:val="single" w:sz="4" w:space="0" w:color="auto"/>
               <w:right w:val="single" w:sz="4" w:space="0" w:color="auto"/>
             </w:tcBorders>
-            <w:shd w:val="clear" w:color="auto" w:fill="auto"/>
             <w:noWrap/>
           </w:tcPr>
           <w:p>
@@ -4460,7 +4342,6 @@
               <w:left w:val="single" w:sz="4" w:space="0" w:color="auto"/>
               <w:right w:val="single" w:sz="4" w:space="0" w:color="auto"/>
             </w:tcBorders>
-            <w:shd w:val="clear" w:color="auto" w:fill="auto"/>
             <w:noWrap/>
           </w:tcPr>
           <w:p>
@@ -4482,7 +4363,6 @@
               <w:bottom w:val="single" w:sz="4" w:space="0" w:color="auto"/>
               <w:right w:val="single" w:sz="4" w:space="0" w:color="auto"/>
             </w:tcBorders>
-            <w:shd w:val="clear" w:color="auto" w:fill="auto"/>
             <w:noWrap/>
           </w:tcPr>
           <w:p>
@@ -4511,7 +4391,6 @@
               <w:bottom w:val="single" w:sz="4" w:space="0" w:color="auto"/>
               <w:right w:val="single" w:sz="4" w:space="0" w:color="auto"/>
             </w:tcBorders>
-            <w:shd w:val="clear" w:color="auto" w:fill="auto"/>
             <w:noWrap/>
           </w:tcPr>
           <w:p>
@@ -4540,7 +4419,6 @@
               <w:bottom w:val="single" w:sz="4" w:space="0" w:color="auto"/>
               <w:right w:val="single" w:sz="4" w:space="0" w:color="auto"/>
             </w:tcBorders>
-            <w:shd w:val="clear" w:color="auto" w:fill="auto"/>
             <w:noWrap/>
           </w:tcPr>
           <w:p>
@@ -4564,7 +4442,6 @@
               <w:bottom w:val="single" w:sz="4" w:space="0" w:color="auto"/>
               <w:right w:val="single" w:sz="4" w:space="0" w:color="auto"/>
             </w:tcBorders>
-            <w:shd w:val="clear" w:color="auto" w:fill="auto"/>
             <w:noWrap/>
           </w:tcPr>
           <w:p>
@@ -4591,7 +4468,6 @@
               <w:left w:val="single" w:sz="4" w:space="0" w:color="auto"/>
               <w:right w:val="single" w:sz="4" w:space="0" w:color="auto"/>
             </w:tcBorders>
-            <w:shd w:val="clear" w:color="auto" w:fill="auto"/>
             <w:noWrap/>
           </w:tcPr>
           <w:p>
@@ -4618,7 +4494,6 @@
               <w:left w:val="single" w:sz="4" w:space="0" w:color="auto"/>
               <w:right w:val="single" w:sz="4" w:space="0" w:color="auto"/>
             </w:tcBorders>
-            <w:shd w:val="clear" w:color="auto" w:fill="auto"/>
             <w:noWrap/>
           </w:tcPr>
           <w:p>
@@ -4647,7 +4522,6 @@
               <w:bottom w:val="single" w:sz="4" w:space="0" w:color="auto"/>
               <w:right w:val="single" w:sz="4" w:space="0" w:color="auto"/>
             </w:tcBorders>
-            <w:shd w:val="clear" w:color="auto" w:fill="auto"/>
             <w:noWrap/>
           </w:tcPr>
           <w:p>
@@ -4676,7 +4550,6 @@
               <w:bottom w:val="single" w:sz="4" w:space="0" w:color="auto"/>
               <w:right w:val="single" w:sz="4" w:space="0" w:color="auto"/>
             </w:tcBorders>
-            <w:shd w:val="clear" w:color="auto" w:fill="auto"/>
             <w:noWrap/>
           </w:tcPr>
           <w:p>
@@ -4703,7 +4576,6 @@
               <w:left w:val="single" w:sz="4" w:space="0" w:color="auto"/>
               <w:right w:val="single" w:sz="4" w:space="0" w:color="auto"/>
             </w:tcBorders>
-            <w:shd w:val="clear" w:color="auto" w:fill="auto"/>
             <w:noWrap/>
           </w:tcPr>
           <w:p>
@@ -4737,7 +4609,6 @@
               <w:left w:val="single" w:sz="4" w:space="0" w:color="auto"/>
               <w:right w:val="single" w:sz="4" w:space="0" w:color="auto"/>
             </w:tcBorders>
-            <w:shd w:val="clear" w:color="auto" w:fill="auto"/>
             <w:noWrap/>
           </w:tcPr>
           <w:p>
@@ -4770,7 +4641,6 @@
               <w:left w:val="single" w:sz="4" w:space="0" w:color="auto"/>
               <w:right w:val="single" w:sz="4" w:space="0" w:color="auto"/>
             </w:tcBorders>
-            <w:shd w:val="clear" w:color="auto" w:fill="auto"/>
             <w:noWrap/>
           </w:tcPr>
           <w:p>
@@ -4798,7 +4668,6 @@
               <w:left w:val="single" w:sz="4" w:space="0" w:color="auto"/>
               <w:right w:val="single" w:sz="4" w:space="0" w:color="auto"/>
             </w:tcBorders>
-            <w:shd w:val="clear" w:color="auto" w:fill="auto"/>
             <w:noWrap/>
           </w:tcPr>
           <w:p>
@@ -4827,7 +4696,6 @@
               <w:bottom w:val="single" w:sz="4" w:space="0" w:color="auto"/>
               <w:right w:val="single" w:sz="4" w:space="0" w:color="auto"/>
             </w:tcBorders>
-            <w:shd w:val="clear" w:color="auto" w:fill="auto"/>
             <w:noWrap/>
           </w:tcPr>
           <w:p>
@@ -4856,7 +4724,6 @@
               <w:bottom w:val="single" w:sz="4" w:space="0" w:color="auto"/>
               <w:right w:val="single" w:sz="4" w:space="0" w:color="auto"/>
             </w:tcBorders>
-            <w:shd w:val="clear" w:color="auto" w:fill="auto"/>
             <w:noWrap/>
           </w:tcPr>
           <w:p>
@@ -4884,7 +4751,6 @@
               <w:left w:val="single" w:sz="4" w:space="0" w:color="auto"/>
               <w:right w:val="single" w:sz="4" w:space="0" w:color="auto"/>
             </w:tcBorders>
-            <w:shd w:val="clear" w:color="auto" w:fill="auto"/>
             <w:noWrap/>
           </w:tcPr>
           <w:p>
@@ -4912,7 +4778,6 @@
               <w:left w:val="single" w:sz="4" w:space="0" w:color="auto"/>
               <w:right w:val="single" w:sz="4" w:space="0" w:color="auto"/>
             </w:tcBorders>
-            <w:shd w:val="clear" w:color="auto" w:fill="auto"/>
             <w:noWrap/>
           </w:tcPr>
           <w:p>
@@ -4945,7 +4810,6 @@
               <w:left w:val="single" w:sz="4" w:space="0" w:color="auto"/>
               <w:right w:val="single" w:sz="4" w:space="0" w:color="auto"/>
             </w:tcBorders>
-            <w:shd w:val="clear" w:color="auto" w:fill="auto"/>
             <w:noWrap/>
           </w:tcPr>
           <w:p>
@@ -4966,7 +4830,6 @@
               <w:left w:val="single" w:sz="4" w:space="0" w:color="auto"/>
               <w:right w:val="single" w:sz="4" w:space="0" w:color="auto"/>
             </w:tcBorders>
-            <w:shd w:val="clear" w:color="auto" w:fill="auto"/>
             <w:noWrap/>
           </w:tcPr>
           <w:p>
@@ -4988,7 +4851,6 @@
               <w:bottom w:val="single" w:sz="4" w:space="0" w:color="auto"/>
               <w:right w:val="single" w:sz="4" w:space="0" w:color="auto"/>
             </w:tcBorders>
-            <w:shd w:val="clear" w:color="auto" w:fill="auto"/>
             <w:noWrap/>
           </w:tcPr>
           <w:p>
@@ -5017,7 +4879,6 @@
               <w:bottom w:val="single" w:sz="4" w:space="0" w:color="auto"/>
               <w:right w:val="single" w:sz="4" w:space="0" w:color="auto"/>
             </w:tcBorders>
-            <w:shd w:val="clear" w:color="auto" w:fill="auto"/>
             <w:noWrap/>
           </w:tcPr>
           <w:p>
@@ -5045,7 +4906,6 @@
               <w:left w:val="single" w:sz="4" w:space="0" w:color="auto"/>
               <w:right w:val="single" w:sz="4" w:space="0" w:color="auto"/>
             </w:tcBorders>
-            <w:shd w:val="clear" w:color="auto" w:fill="auto"/>
             <w:noWrap/>
           </w:tcPr>
           <w:p>
@@ -5066,7 +4926,6 @@
               <w:left w:val="single" w:sz="4" w:space="0" w:color="auto"/>
               <w:right w:val="single" w:sz="4" w:space="0" w:color="auto"/>
             </w:tcBorders>
-            <w:shd w:val="clear" w:color="auto" w:fill="auto"/>
             <w:noWrap/>
           </w:tcPr>
           <w:p>
@@ -5092,7 +4951,6 @@
               <w:left w:val="single" w:sz="4" w:space="0" w:color="auto"/>
               <w:right w:val="single" w:sz="4" w:space="0" w:color="auto"/>
             </w:tcBorders>
-            <w:shd w:val="clear" w:color="auto" w:fill="auto"/>
             <w:noWrap/>
           </w:tcPr>
           <w:p>
@@ -5113,7 +4971,6 @@
               <w:left w:val="single" w:sz="4" w:space="0" w:color="auto"/>
               <w:right w:val="single" w:sz="4" w:space="0" w:color="auto"/>
             </w:tcBorders>
-            <w:shd w:val="clear" w:color="auto" w:fill="auto"/>
             <w:noWrap/>
           </w:tcPr>
           <w:p>
@@ -5135,7 +4992,6 @@
               <w:bottom w:val="single" w:sz="4" w:space="0" w:color="auto"/>
               <w:right w:val="single" w:sz="4" w:space="0" w:color="auto"/>
             </w:tcBorders>
-            <w:shd w:val="clear" w:color="auto" w:fill="auto"/>
             <w:noWrap/>
           </w:tcPr>
           <w:p>
@@ -5164,7 +5020,6 @@
               <w:bottom w:val="single" w:sz="4" w:space="0" w:color="auto"/>
               <w:right w:val="single" w:sz="4" w:space="0" w:color="auto"/>
             </w:tcBorders>
-            <w:shd w:val="clear" w:color="auto" w:fill="auto"/>
             <w:noWrap/>
           </w:tcPr>
           <w:p>
@@ -5192,7 +5047,6 @@
               <w:left w:val="single" w:sz="4" w:space="0" w:color="auto"/>
               <w:right w:val="single" w:sz="4" w:space="0" w:color="auto"/>
             </w:tcBorders>
-            <w:shd w:val="clear" w:color="auto" w:fill="auto"/>
             <w:noWrap/>
           </w:tcPr>
           <w:p>
@@ -5213,7 +5067,6 @@
               <w:left w:val="single" w:sz="4" w:space="0" w:color="auto"/>
               <w:right w:val="single" w:sz="4" w:space="0" w:color="auto"/>
             </w:tcBorders>
-            <w:shd w:val="clear" w:color="auto" w:fill="auto"/>
             <w:noWrap/>
           </w:tcPr>
           <w:p>
@@ -5239,7 +5092,6 @@
               <w:left w:val="single" w:sz="4" w:space="0" w:color="auto"/>
               <w:right w:val="single" w:sz="4" w:space="0" w:color="auto"/>
             </w:tcBorders>
-            <w:shd w:val="clear" w:color="auto" w:fill="auto"/>
             <w:noWrap/>
           </w:tcPr>
           <w:p>
@@ -5260,7 +5112,6 @@
               <w:left w:val="single" w:sz="4" w:space="0" w:color="auto"/>
               <w:right w:val="single" w:sz="4" w:space="0" w:color="auto"/>
             </w:tcBorders>
-            <w:shd w:val="clear" w:color="auto" w:fill="auto"/>
             <w:noWrap/>
           </w:tcPr>
           <w:p>
@@ -5282,7 +5133,6 @@
               <w:bottom w:val="single" w:sz="4" w:space="0" w:color="auto"/>
               <w:right w:val="single" w:sz="4" w:space="0" w:color="auto"/>
             </w:tcBorders>
-            <w:shd w:val="clear" w:color="auto" w:fill="auto"/>
             <w:noWrap/>
           </w:tcPr>
           <w:p>
@@ -5311,7 +5161,6 @@
               <w:bottom w:val="single" w:sz="4" w:space="0" w:color="auto"/>
               <w:right w:val="single" w:sz="4" w:space="0" w:color="auto"/>
             </w:tcBorders>
-            <w:shd w:val="clear" w:color="auto" w:fill="auto"/>
             <w:noWrap/>
           </w:tcPr>
           <w:p>
@@ -5339,7 +5188,6 @@
               <w:left w:val="single" w:sz="4" w:space="0" w:color="auto"/>
               <w:right w:val="single" w:sz="4" w:space="0" w:color="auto"/>
             </w:tcBorders>
-            <w:shd w:val="clear" w:color="auto" w:fill="auto"/>
             <w:noWrap/>
           </w:tcPr>
           <w:p>
@@ -5360,7 +5208,6 @@
               <w:left w:val="single" w:sz="4" w:space="0" w:color="auto"/>
               <w:right w:val="single" w:sz="4" w:space="0" w:color="auto"/>
             </w:tcBorders>
-            <w:shd w:val="clear" w:color="auto" w:fill="auto"/>
             <w:noWrap/>
           </w:tcPr>
           <w:p>
@@ -5386,7 +5233,6 @@
               <w:left w:val="single" w:sz="4" w:space="0" w:color="auto"/>
               <w:right w:val="single" w:sz="4" w:space="0" w:color="auto"/>
             </w:tcBorders>
-            <w:shd w:val="clear" w:color="auto" w:fill="auto"/>
             <w:noWrap/>
           </w:tcPr>
           <w:p>
@@ -5407,7 +5253,6 @@
               <w:left w:val="single" w:sz="4" w:space="0" w:color="auto"/>
               <w:right w:val="single" w:sz="4" w:space="0" w:color="auto"/>
             </w:tcBorders>
-            <w:shd w:val="clear" w:color="auto" w:fill="auto"/>
             <w:noWrap/>
           </w:tcPr>
           <w:p>
@@ -5429,7 +5274,6 @@
               <w:bottom w:val="single" w:sz="4" w:space="0" w:color="auto"/>
               <w:right w:val="single" w:sz="4" w:space="0" w:color="auto"/>
             </w:tcBorders>
-            <w:shd w:val="clear" w:color="auto" w:fill="auto"/>
             <w:noWrap/>
           </w:tcPr>
           <w:p>
@@ -5458,7 +5302,6 @@
               <w:bottom w:val="single" w:sz="4" w:space="0" w:color="auto"/>
               <w:right w:val="single" w:sz="4" w:space="0" w:color="auto"/>
             </w:tcBorders>
-            <w:shd w:val="clear" w:color="auto" w:fill="auto"/>
             <w:noWrap/>
           </w:tcPr>
           <w:p>
@@ -5486,7 +5329,6 @@
               <w:left w:val="single" w:sz="4" w:space="0" w:color="auto"/>
               <w:right w:val="single" w:sz="4" w:space="0" w:color="auto"/>
             </w:tcBorders>
-            <w:shd w:val="clear" w:color="auto" w:fill="auto"/>
             <w:noWrap/>
           </w:tcPr>
           <w:p>
@@ -5507,7 +5349,6 @@
               <w:left w:val="single" w:sz="4" w:space="0" w:color="auto"/>
               <w:right w:val="single" w:sz="4" w:space="0" w:color="auto"/>
             </w:tcBorders>
-            <w:shd w:val="clear" w:color="auto" w:fill="auto"/>
             <w:noWrap/>
           </w:tcPr>
           <w:p>
@@ -5533,7 +5374,6 @@
               <w:left w:val="single" w:sz="4" w:space="0" w:color="auto"/>
               <w:right w:val="single" w:sz="4" w:space="0" w:color="auto"/>
             </w:tcBorders>
-            <w:shd w:val="clear" w:color="auto" w:fill="auto"/>
             <w:noWrap/>
           </w:tcPr>
           <w:p>
@@ -5554,7 +5394,6 @@
               <w:left w:val="single" w:sz="4" w:space="0" w:color="auto"/>
               <w:right w:val="single" w:sz="4" w:space="0" w:color="auto"/>
             </w:tcBorders>
-            <w:shd w:val="clear" w:color="auto" w:fill="auto"/>
             <w:noWrap/>
           </w:tcPr>
           <w:p>
@@ -5576,7 +5415,6 @@
               <w:bottom w:val="single" w:sz="4" w:space="0" w:color="auto"/>
               <w:right w:val="single" w:sz="4" w:space="0" w:color="auto"/>
             </w:tcBorders>
-            <w:shd w:val="clear" w:color="auto" w:fill="auto"/>
             <w:noWrap/>
           </w:tcPr>
           <w:p>
@@ -5605,7 +5443,6 @@
               <w:bottom w:val="single" w:sz="4" w:space="0" w:color="auto"/>
               <w:right w:val="single" w:sz="4" w:space="0" w:color="auto"/>
             </w:tcBorders>
-            <w:shd w:val="clear" w:color="auto" w:fill="auto"/>
             <w:noWrap/>
           </w:tcPr>
           <w:p>
@@ -5634,7 +5471,6 @@
               <w:bottom w:val="single" w:sz="4" w:space="0" w:color="auto"/>
               <w:right w:val="single" w:sz="4" w:space="0" w:color="auto"/>
             </w:tcBorders>
-            <w:shd w:val="clear" w:color="auto" w:fill="auto"/>
             <w:noWrap/>
           </w:tcPr>
           <w:p>
@@ -5656,7 +5492,6 @@
               <w:bottom w:val="single" w:sz="4" w:space="0" w:color="auto"/>
               <w:right w:val="single" w:sz="4" w:space="0" w:color="auto"/>
             </w:tcBorders>
-            <w:shd w:val="clear" w:color="auto" w:fill="auto"/>
             <w:noWrap/>
           </w:tcPr>
           <w:p>
@@ -5681,7 +5516,6 @@
               <w:left w:val="single" w:sz="4" w:space="0" w:color="auto"/>
               <w:right w:val="single" w:sz="4" w:space="0" w:color="auto"/>
             </w:tcBorders>
-            <w:shd w:val="clear" w:color="auto" w:fill="auto"/>
             <w:noWrap/>
           </w:tcPr>
           <w:p>
@@ -5715,7 +5549,6 @@
               <w:left w:val="single" w:sz="4" w:space="0" w:color="auto"/>
               <w:right w:val="single" w:sz="4" w:space="0" w:color="auto"/>
             </w:tcBorders>
-            <w:shd w:val="clear" w:color="auto" w:fill="auto"/>
             <w:noWrap/>
           </w:tcPr>
           <w:p>
@@ -5744,7 +5577,6 @@
               <w:bottom w:val="single" w:sz="4" w:space="0" w:color="auto"/>
               <w:right w:val="single" w:sz="4" w:space="0" w:color="auto"/>
             </w:tcBorders>
-            <w:shd w:val="clear" w:color="auto" w:fill="auto"/>
             <w:noWrap/>
           </w:tcPr>
           <w:p>
@@ -5775,7 +5607,6 @@
               <w:bottom w:val="single" w:sz="4" w:space="0" w:color="auto"/>
               <w:right w:val="single" w:sz="4" w:space="0" w:color="auto"/>
             </w:tcBorders>
-            <w:shd w:val="clear" w:color="auto" w:fill="auto"/>
             <w:noWrap/>
           </w:tcPr>
           <w:p>
@@ -5805,7 +5636,6 @@
               <w:bottom w:val="single" w:sz="4" w:space="0" w:color="auto"/>
               <w:right w:val="single" w:sz="4" w:space="0" w:color="auto"/>
             </w:tcBorders>
-            <w:shd w:val="clear" w:color="auto" w:fill="auto"/>
             <w:noWrap/>
           </w:tcPr>
           <w:p>
@@ -5842,7 +5672,6 @@
               <w:bottom w:val="single" w:sz="4" w:space="0" w:color="auto"/>
               <w:right w:val="single" w:sz="4" w:space="0" w:color="auto"/>
             </w:tcBorders>
-            <w:shd w:val="clear" w:color="auto" w:fill="auto"/>
             <w:noWrap/>
           </w:tcPr>
           <w:p>
@@ -6398,7 +6227,6 @@
         <w:tc>
           <w:tcPr>
             <w:tcW w:w="2533" w:type="dxa"/>
-            <w:shd w:val="clear" w:color="auto" w:fill="auto"/>
             <w:noWrap/>
           </w:tcPr>
           <w:p>
@@ -6421,7 +6249,6 @@
         <w:tc>
           <w:tcPr>
             <w:tcW w:w="5377" w:type="dxa"/>
-            <w:shd w:val="clear" w:color="auto" w:fill="auto"/>
             <w:noWrap/>
           </w:tcPr>
           <w:p>
@@ -6449,7 +6276,6 @@
         <w:tc>
           <w:tcPr>
             <w:tcW w:w="2533" w:type="dxa"/>
-            <w:shd w:val="clear" w:color="auto" w:fill="auto"/>
             <w:noWrap/>
           </w:tcPr>
           <w:p>
@@ -6472,7 +6298,6 @@
         <w:tc>
           <w:tcPr>
             <w:tcW w:w="5377" w:type="dxa"/>
-            <w:shd w:val="clear" w:color="auto" w:fill="auto"/>
             <w:noWrap/>
           </w:tcPr>
           <w:p>
@@ -6500,7 +6325,6 @@
         <w:tc>
           <w:tcPr>
             <w:tcW w:w="2533" w:type="dxa"/>
-            <w:shd w:val="clear" w:color="auto" w:fill="auto"/>
             <w:noWrap/>
           </w:tcPr>
           <w:p>
@@ -6523,7 +6347,6 @@
         <w:tc>
           <w:tcPr>
             <w:tcW w:w="5377" w:type="dxa"/>
-            <w:shd w:val="clear" w:color="auto" w:fill="auto"/>
             <w:noWrap/>
           </w:tcPr>
           <w:p>
@@ -6551,7 +6374,6 @@
         <w:tc>
           <w:tcPr>
             <w:tcW w:w="2533" w:type="dxa"/>
-            <w:shd w:val="clear" w:color="auto" w:fill="auto"/>
             <w:noWrap/>
           </w:tcPr>
           <w:p>
@@ -6574,7 +6396,6 @@
         <w:tc>
           <w:tcPr>
             <w:tcW w:w="5377" w:type="dxa"/>
-            <w:shd w:val="clear" w:color="auto" w:fill="auto"/>
             <w:noWrap/>
           </w:tcPr>
           <w:p>
@@ -6602,7 +6423,6 @@
         <w:tc>
           <w:tcPr>
             <w:tcW w:w="2533" w:type="dxa"/>
-            <w:shd w:val="clear" w:color="auto" w:fill="auto"/>
             <w:noWrap/>
           </w:tcPr>
           <w:p>
@@ -6625,7 +6445,6 @@
         <w:tc>
           <w:tcPr>
             <w:tcW w:w="5377" w:type="dxa"/>
-            <w:shd w:val="clear" w:color="auto" w:fill="auto"/>
             <w:noWrap/>
           </w:tcPr>
           <w:p>
@@ -6653,7 +6472,6 @@
         <w:tc>
           <w:tcPr>
             <w:tcW w:w="2533" w:type="dxa"/>
-            <w:shd w:val="clear" w:color="auto" w:fill="auto"/>
             <w:noWrap/>
           </w:tcPr>
           <w:p>
@@ -6676,7 +6494,6 @@
         <w:tc>
           <w:tcPr>
             <w:tcW w:w="5377" w:type="dxa"/>
-            <w:shd w:val="clear" w:color="auto" w:fill="auto"/>
             <w:noWrap/>
           </w:tcPr>
           <w:p>
@@ -6704,7 +6521,6 @@
         <w:tc>
           <w:tcPr>
             <w:tcW w:w="2533" w:type="dxa"/>
-            <w:shd w:val="clear" w:color="auto" w:fill="auto"/>
             <w:noWrap/>
           </w:tcPr>
           <w:p>
@@ -6727,7 +6543,6 @@
         <w:tc>
           <w:tcPr>
             <w:tcW w:w="5377" w:type="dxa"/>
-            <w:shd w:val="clear" w:color="auto" w:fill="auto"/>
             <w:noWrap/>
           </w:tcPr>
           <w:p>
@@ -6880,7 +6695,6 @@
         <w:tc>
           <w:tcPr>
             <w:tcW w:w="2533" w:type="dxa"/>
-            <w:shd w:val="clear" w:color="auto" w:fill="auto"/>
             <w:noWrap/>
           </w:tcPr>
           <w:p>
@@ -6903,7 +6717,6 @@
         <w:tc>
           <w:tcPr>
             <w:tcW w:w="5377" w:type="dxa"/>
-            <w:shd w:val="clear" w:color="auto" w:fill="auto"/>
             <w:noWrap/>
           </w:tcPr>
           <w:p>

</xml_diff>

<commit_message>
3.5.1-to-3.5.0 translation: Corrected translation of US National Grid coordinates with leading zeros.
</commit_message>
<xml_diff>
--- a/Translation/v3.5.1 to v3.5.0/documentation.docx
+++ b/Translation/v3.5.1 to v3.5.0/documentation.docx
@@ -74,28 +74,13 @@
     </w:p>
     <w:p>
       <w:r>
-        <w:t xml:space="preserve">September </w:t>
-      </w:r>
-      <w:r>
-        <w:t>25, 2025 (Updated to versions 3.5.1.25</w:t>
-      </w:r>
-      <w:r>
-        <w:t>1001</w:t>
-      </w:r>
-      <w:r>
-        <w:t>CP</w:t>
-      </w:r>
-      <w:r>
-        <w:t>2</w:t>
-      </w:r>
-      <w:r>
-        <w:t xml:space="preserve"> and 3.5.0.25</w:t>
-      </w:r>
-      <w:r>
-        <w:t>1001CP6</w:t>
-      </w:r>
-      <w:r>
-        <w:t>; no substantive changes)</w:t>
+        <w:t>March 31, 2026 (Corrected translation of US National Grid coordinates with leading zeros)</w:t>
+      </w:r>
+      <w:r>
+        <w:br/>
+      </w:r>
+      <w:r>
+        <w:t>September 25, 2025 (Updated to versions 3.5.1.251001CP2 and 3.5.0.251001CP6; no substantive changes)</w:t>
       </w:r>
       <w:r>
         <w:br/>
@@ -2289,7 +2274,6 @@
                 <w:sz w:val="18"/>
                 <w:szCs w:val="18"/>
               </w:rPr>
-              <w:lastRenderedPageBreak/>
               <w:t>eArrest.14</w:t>
             </w:r>
           </w:p>

</xml_diff>